<commit_message>
Document Ubuntu LTS downloads and 22.04 source-only builds
</commit_message>
<xml_diff>
--- a/docs/manual/Maritime_Ship_Simulator_User_Guide_2.3.0.docx
+++ b/docs/manual/Maritime_Ship_Simulator_User_Guide_2.3.0.docx
@@ -4347,18 +4347,7 @@
             <w:vAlign w:val="center"/>
           </w:tcPr>
           <w:p>
-            <w:pPr>
-              <w:keepNext/>
-              <w:spacing w:after="40"/>
-              <w:rPr>
-                <w:lang w:val="en-GB"/>
-              </w:rPr>
-            </w:pPr>
-            <w:r>
-              <w:rPr>
-                <w:sz w:val="17"/>
-                <w:lang w:val="en-GB"/>
-              </w:rPr>
+            <w:r>
               <w:t>Ubuntu 22.04</w:t>
             </w:r>
           </w:p>
@@ -4376,19 +4365,8 @@
             <w:vAlign w:val="center"/>
           </w:tcPr>
           <w:p>
-            <w:pPr>
-              <w:keepNext/>
-              <w:spacing w:after="40"/>
-              <w:rPr>
-                <w:lang w:val="en-GB"/>
-              </w:rPr>
-            </w:pPr>
-            <w:r>
-              <w:rPr>
-                <w:sz w:val="17"/>
-                <w:lang w:val="en-GB"/>
-              </w:rPr>
-              <w:t>22.04-specific DEB</w:t>
+            <w:r>
+              <w:t>Self-build only</w:t>
             </w:r>
           </w:p>
         </w:tc>
@@ -4405,35 +4383,8 @@
             <w:vAlign w:val="center"/>
           </w:tcPr>
           <w:p>
-            <w:pPr>
-              <w:keepNext/>
-              <w:spacing w:after="40"/>
-              <w:rPr>
-                <w:lang w:val="en-GB"/>
-              </w:rPr>
-            </w:pPr>
-            <w:r>
-              <w:rPr>
-                <w:sz w:val="17"/>
-                <w:lang w:val="en-GB"/>
-              </w:rPr>
-              <w:t xml:space="preserve">22.04-specific </w:t>
-            </w:r>
-            <w:proofErr w:type="spellStart"/>
-            <w:r>
-              <w:rPr>
-                <w:sz w:val="17"/>
-                <w:lang w:val="en-GB"/>
-              </w:rPr>
-              <w:t>AppImage</w:t>
-            </w:r>
-            <w:proofErr w:type="spellEnd"/>
-            <w:r>
-              <w:rPr>
-                <w:sz w:val="17"/>
-                <w:lang w:val="en-GB"/>
-              </w:rPr>
-              <w:t>/tar.gz</w:t>
+            <w:r>
+              <w:t>No prebuilt package</w:t>
             </w:r>
           </w:p>
         </w:tc>
@@ -4450,19 +4401,8 @@
             <w:vAlign w:val="center"/>
           </w:tcPr>
           <w:p>
-            <w:pPr>
-              <w:keepNext/>
-              <w:spacing w:after="40"/>
-              <w:rPr>
-                <w:lang w:val="en-GB"/>
-              </w:rPr>
-            </w:pPr>
-            <w:r>
-              <w:rPr>
-                <w:sz w:val="17"/>
-                <w:lang w:val="en-GB"/>
-              </w:rPr>
-              <w:t>Use this build to avoid newer GLIBC requirements.</w:t>
+            <w:r>
+              <w:t>Build on 22.04; validate locally.</w:t>
             </w:r>
           </w:p>
         </w:tc>
@@ -4711,10 +4651,7 @@
         </w:rPr>
       </w:pPr>
       <w:r>
-        <w:rPr>
-          <w:lang w:val="en-GB"/>
-        </w:rPr>
-        <w:t>The package declares the required Qt/XCB libraries, including libxcb-icccm4 and libxcb-keysyms1. If the host is Ubuntu 22.04, use only the 22.04-specific build. A package built on a newer distribution can fail with GLIBC_2.38 not found.</w:t>
+        <w:t>The package declares Qt/XCB libraries, including libxcb-icccm4 and libxcb-keysyms1. Match the release's Ubuntu version and architecture. No 22.04 binary is provided; on 22.04, run bash scripts/build-v2-ubuntu-22.04.sh from the source instead.</w:t>
       </w:r>
     </w:p>
     <w:p>
@@ -18246,18 +18183,8 @@
             <w:vAlign w:val="center"/>
           </w:tcPr>
           <w:p>
-            <w:pPr>
-              <w:spacing w:after="40"/>
-              <w:rPr>
-                <w:lang w:val="en-GB"/>
-              </w:rPr>
-            </w:pPr>
-            <w:r>
-              <w:rPr>
-                <w:sz w:val="17"/>
-                <w:lang w:val="en-GB"/>
-              </w:rPr>
-              <w:t>Install the Ubuntu 22.04-specific artifact; rebuilding on 22.04 also establishes an older GLIBC baseline.</w:t>
+            <w:r>
+              <w:t>Use a matching Ubuntu build; on 22.04 use the source build script. AppImage does not remove GLIBC requirements. Do not replace system GLIBC.</w:t>
             </w:r>
           </w:p>
         </w:tc>

</xml_diff>